<commit_message>
modicication du fichier de documentation d'erreur
</commit_message>
<xml_diff>
--- a/documentation d'erreur.docx
+++ b/documentation d'erreur.docx
@@ -675,7 +675,14 @@
         <w:rPr>
           <w:rFonts w:ascii="Times New Roman" w:hAnsi="Times New Roman" w:cs="Times New Roman"/>
         </w:rPr>
-        <w:t xml:space="preserve">On va remplacer cette </w:t>
+        <w:t xml:space="preserve">On va remplacer </w:t>
+      </w:r>
+      <w:proofErr w:type="gramStart"/>
+      <w:r>
+        <w:rPr>
+          <w:rFonts w:ascii="Times New Roman" w:hAnsi="Times New Roman" w:cs="Times New Roman"/>
+        </w:rPr>
+        <w:t xml:space="preserve">cette </w:t>
       </w:r>
       <w:r>
         <w:rPr>
@@ -683,6 +690,7 @@
         </w:rPr>
         <w:t>caractère</w:t>
       </w:r>
+      <w:proofErr w:type="gramEnd"/>
       <w:r>
         <w:rPr>
           <w:rFonts w:ascii="Times New Roman" w:hAnsi="Times New Roman" w:cs="Times New Roman"/>
@@ -810,6 +818,7 @@
         <w:t xml:space="preserve"> </w:t>
       </w:r>
       <w:proofErr w:type="spellStart"/>
+      <w:proofErr w:type="gramStart"/>
       <w:r>
         <w:rPr>
           <w:rFonts w:ascii="Times New Roman" w:hAnsi="Times New Roman" w:cs="Times New Roman"/>
@@ -817,6 +826,7 @@
         <w:t>a</w:t>
       </w:r>
       <w:proofErr w:type="spellEnd"/>
+      <w:proofErr w:type="gramEnd"/>
       <w:r>
         <w:rPr>
           <w:rFonts w:ascii="Times New Roman" w:hAnsi="Times New Roman" w:cs="Times New Roman"/>
@@ -1010,7 +1020,21 @@
         <w:rPr>
           <w:rFonts w:ascii="Times New Roman" w:hAnsi="Times New Roman" w:cs="Times New Roman"/>
         </w:rPr>
-        <w:t xml:space="preserve"> position une erreur qui va bugger l’application car la variable total est </w:t>
+        <w:t xml:space="preserve"> position une erreur qui va bugger l’application car </w:t>
+      </w:r>
+      <w:proofErr w:type="gramStart"/>
+      <w:r>
+        <w:rPr>
+          <w:rFonts w:ascii="Times New Roman" w:hAnsi="Times New Roman" w:cs="Times New Roman"/>
+        </w:rPr>
+        <w:t>la variable total</w:t>
+      </w:r>
+      <w:proofErr w:type="gramEnd"/>
+      <w:r>
+        <w:rPr>
+          <w:rFonts w:ascii="Times New Roman" w:hAnsi="Times New Roman" w:cs="Times New Roman"/>
+        </w:rPr>
+        <w:t xml:space="preserve"> est </w:t>
       </w:r>
       <w:r>
         <w:rPr>
@@ -1022,33 +1046,75 @@
         <w:rPr>
           <w:rFonts w:ascii="Times New Roman" w:hAnsi="Times New Roman" w:cs="Times New Roman"/>
         </w:rPr>
+        <w:t xml:space="preserve"> </w:t>
+      </w:r>
+      <w:proofErr w:type="gramStart"/>
+      <w:r>
+        <w:rPr>
+          <w:rFonts w:ascii="Times New Roman" w:hAnsi="Times New Roman" w:cs="Times New Roman"/>
+        </w:rPr>
+        <w:t>a</w:t>
+      </w:r>
+      <w:proofErr w:type="gramEnd"/>
+      <w:r>
+        <w:rPr>
+          <w:rFonts w:ascii="Times New Roman" w:hAnsi="Times New Roman" w:cs="Times New Roman"/>
+        </w:rPr>
+        <w:t xml:space="preserve"> l’</w:t>
+      </w:r>
+      <w:r>
+        <w:rPr>
+          <w:rFonts w:ascii="Times New Roman" w:hAnsi="Times New Roman" w:cs="Times New Roman"/>
+        </w:rPr>
+        <w:t>intérieur</w:t>
+      </w:r>
+      <w:r>
+        <w:rPr>
+          <w:rFonts w:ascii="Times New Roman" w:hAnsi="Times New Roman" w:cs="Times New Roman"/>
+        </w:rPr>
+        <w:t xml:space="preserve"> </w:t>
+      </w:r>
+      <w:proofErr w:type="gramStart"/>
+      <w:r>
+        <w:rPr>
+          <w:rFonts w:ascii="Times New Roman" w:hAnsi="Times New Roman" w:cs="Times New Roman"/>
+        </w:rPr>
+        <w:t>du boucle</w:t>
+      </w:r>
+      <w:proofErr w:type="gramEnd"/>
+      <w:r>
+        <w:rPr>
+          <w:rFonts w:ascii="Times New Roman" w:hAnsi="Times New Roman" w:cs="Times New Roman"/>
+        </w:rPr>
+        <w:t xml:space="preserve"> donc a chaque fois il se met a </w:t>
+      </w:r>
+      <w:proofErr w:type="spellStart"/>
+      <w:r>
+        <w:rPr>
+          <w:rFonts w:ascii="Times New Roman" w:hAnsi="Times New Roman" w:cs="Times New Roman"/>
+        </w:rPr>
+        <w:t>zero</w:t>
+      </w:r>
+      <w:proofErr w:type="spellEnd"/>
+      <w:r>
+        <w:rPr>
+          <w:rFonts w:ascii="Times New Roman" w:hAnsi="Times New Roman" w:cs="Times New Roman"/>
+        </w:rPr>
+        <w:t xml:space="preserve">, et pour corriger cette erreur il faut juste enlever </w:t>
+      </w:r>
+      <w:proofErr w:type="gramStart"/>
+      <w:r>
+        <w:rPr>
+          <w:rFonts w:ascii="Times New Roman" w:hAnsi="Times New Roman" w:cs="Times New Roman"/>
+        </w:rPr>
+        <w:t>la variable total</w:t>
+      </w:r>
+      <w:proofErr w:type="gramEnd"/>
+      <w:r>
+        <w:rPr>
+          <w:rFonts w:ascii="Times New Roman" w:hAnsi="Times New Roman" w:cs="Times New Roman"/>
+        </w:rPr>
         <w:t xml:space="preserve"> a l’</w:t>
-      </w:r>
-      <w:r>
-        <w:rPr>
-          <w:rFonts w:ascii="Times New Roman" w:hAnsi="Times New Roman" w:cs="Times New Roman"/>
-        </w:rPr>
-        <w:t>intérieur</w:t>
-      </w:r>
-      <w:r>
-        <w:rPr>
-          <w:rFonts w:ascii="Times New Roman" w:hAnsi="Times New Roman" w:cs="Times New Roman"/>
-        </w:rPr>
-        <w:t xml:space="preserve"> du boucle donc a chaque fois il se met a </w:t>
-      </w:r>
-      <w:proofErr w:type="spellStart"/>
-      <w:r>
-        <w:rPr>
-          <w:rFonts w:ascii="Times New Roman" w:hAnsi="Times New Roman" w:cs="Times New Roman"/>
-        </w:rPr>
-        <w:t>zero</w:t>
-      </w:r>
-      <w:proofErr w:type="spellEnd"/>
-      <w:r>
-        <w:rPr>
-          <w:rFonts w:ascii="Times New Roman" w:hAnsi="Times New Roman" w:cs="Times New Roman"/>
-        </w:rPr>
-        <w:t>, et pour corriger cette erreur il faut juste enlever la variable total a l’</w:t>
       </w:r>
       <w:r>
         <w:rPr>
@@ -1227,9 +1293,19 @@
           <w:b/>
           <w:bCs/>
         </w:rPr>
-        <w:t>widget_test.dart</w:t>
+        <w:t>widget_</w:t>
+      </w:r>
+      <w:proofErr w:type="gramStart"/>
+      <w:r>
+        <w:rPr>
+          <w:rFonts w:ascii="Times New Roman" w:hAnsi="Times New Roman" w:cs="Times New Roman"/>
+          <w:b/>
+          <w:bCs/>
+        </w:rPr>
+        <w:t>test.dart</w:t>
       </w:r>
       <w:proofErr w:type="spellEnd"/>
+      <w:proofErr w:type="gramEnd"/>
       <w:r>
         <w:rPr>
           <w:rFonts w:ascii="Times New Roman" w:hAnsi="Times New Roman" w:cs="Times New Roman"/>
@@ -1319,9 +1395,19 @@
           <w:b/>
           <w:bCs/>
         </w:rPr>
-        <w:t>widget_test.dart</w:t>
+        <w:t>widget_</w:t>
+      </w:r>
+      <w:proofErr w:type="gramStart"/>
+      <w:r>
+        <w:rPr>
+          <w:rFonts w:ascii="Times New Roman" w:hAnsi="Times New Roman" w:cs="Times New Roman"/>
+          <w:b/>
+          <w:bCs/>
+        </w:rPr>
+        <w:t>test.dart</w:t>
       </w:r>
       <w:proofErr w:type="spellEnd"/>
+      <w:proofErr w:type="gramEnd"/>
       <w:r>
         <w:rPr>
           <w:rFonts w:ascii="Times New Roman" w:hAnsi="Times New Roman" w:cs="Times New Roman"/>
@@ -1447,9 +1533,787 @@
         </w:rPr>
       </w:pPr>
     </w:p>
+    <w:p>
+      <w:pPr>
+        <w:pStyle w:val="Paragraphedeliste"/>
+        <w:rPr>
+          <w:rFonts w:ascii="Times New Roman" w:hAnsi="Times New Roman" w:cs="Times New Roman"/>
+        </w:rPr>
+      </w:pPr>
+      <w:r>
+        <w:rPr>
+          <w:rFonts w:ascii="Times New Roman" w:hAnsi="Times New Roman" w:cs="Times New Roman"/>
+        </w:rPr>
+        <w:t>B- TEST UNITAIRE</w:t>
+      </w:r>
+    </w:p>
+    <w:p>
+      <w:pPr>
+        <w:pStyle w:val="Paragraphedeliste"/>
+        <w:rPr>
+          <w:rFonts w:ascii="Times New Roman" w:hAnsi="Times New Roman" w:cs="Times New Roman"/>
+        </w:rPr>
+      </w:pPr>
+      <w:r>
+        <w:rPr>
+          <w:rFonts w:ascii="Times New Roman" w:hAnsi="Times New Roman" w:cs="Times New Roman"/>
+        </w:rPr>
+        <w:t xml:space="preserve">Pour ce fait on va tester la fonction </w:t>
+      </w:r>
+      <w:proofErr w:type="spellStart"/>
+      <w:r>
+        <w:rPr>
+          <w:rFonts w:ascii="Times New Roman" w:hAnsi="Times New Roman" w:cs="Times New Roman"/>
+        </w:rPr>
+        <w:t>calculateMoyenne</w:t>
+      </w:r>
+      <w:proofErr w:type="spellEnd"/>
+    </w:p>
+    <w:p>
+      <w:pPr>
+        <w:pStyle w:val="Paragraphedeliste"/>
+        <w:rPr>
+          <w:rFonts w:ascii="Times New Roman" w:hAnsi="Times New Roman" w:cs="Times New Roman"/>
+        </w:rPr>
+      </w:pPr>
+      <w:r>
+        <w:rPr>
+          <w:rFonts w:ascii="Times New Roman" w:hAnsi="Times New Roman" w:cs="Times New Roman"/>
+        </w:rPr>
+        <w:drawing>
+          <wp:inline distT="0" distB="0" distL="0" distR="0" wp14:anchorId="019B50B1" wp14:editId="2FB7EC6A">
+            <wp:extent cx="5760720" cy="683260"/>
+            <wp:effectExtent l="0" t="0" r="0" b="2540"/>
+            <wp:docPr id="1825474893" name="Image 1"/>
+            <wp:cNvGraphicFramePr>
+              <a:graphicFrameLocks xmlns:a="http://schemas.openxmlformats.org/drawingml/2006/main" noChangeAspect="1"/>
+            </wp:cNvGraphicFramePr>
+            <a:graphic xmlns:a="http://schemas.openxmlformats.org/drawingml/2006/main">
+              <a:graphicData uri="http://schemas.openxmlformats.org/drawingml/2006/picture">
+                <pic:pic xmlns:pic="http://schemas.openxmlformats.org/drawingml/2006/picture">
+                  <pic:nvPicPr>
+                    <pic:cNvPr id="1825474893" name=""/>
+                    <pic:cNvPicPr/>
+                  </pic:nvPicPr>
+                  <pic:blipFill>
+                    <a:blip r:embed="rId20"/>
+                    <a:stretch>
+                      <a:fillRect/>
+                    </a:stretch>
+                  </pic:blipFill>
+                  <pic:spPr>
+                    <a:xfrm>
+                      <a:off x="0" y="0"/>
+                      <a:ext cx="5760720" cy="683260"/>
+                    </a:xfrm>
+                    <a:prstGeom prst="rect">
+                      <a:avLst/>
+                    </a:prstGeom>
+                  </pic:spPr>
+                </pic:pic>
+              </a:graphicData>
+            </a:graphic>
+          </wp:inline>
+        </w:drawing>
+      </w:r>
+    </w:p>
+    <w:p>
+      <w:pPr>
+        <w:pStyle w:val="Paragraphedeliste"/>
+        <w:rPr>
+          <w:rFonts w:ascii="Times New Roman" w:hAnsi="Times New Roman" w:cs="Times New Roman"/>
+        </w:rPr>
+      </w:pPr>
+      <w:proofErr w:type="spellStart"/>
+      <w:r>
+        <w:rPr>
+          <w:rFonts w:ascii="Times New Roman" w:hAnsi="Times New Roman" w:cs="Times New Roman"/>
+        </w:rPr>
+        <w:t>Dapres</w:t>
+      </w:r>
+      <w:proofErr w:type="spellEnd"/>
+      <w:r>
+        <w:rPr>
+          <w:rFonts w:ascii="Times New Roman" w:hAnsi="Times New Roman" w:cs="Times New Roman"/>
+        </w:rPr>
+        <w:t xml:space="preserve"> la capture d’</w:t>
+      </w:r>
+      <w:proofErr w:type="spellStart"/>
+      <w:r>
+        <w:rPr>
+          <w:rFonts w:ascii="Times New Roman" w:hAnsi="Times New Roman" w:cs="Times New Roman"/>
+        </w:rPr>
+        <w:t>ecran</w:t>
+      </w:r>
+      <w:proofErr w:type="spellEnd"/>
+      <w:r>
+        <w:rPr>
+          <w:rFonts w:ascii="Times New Roman" w:hAnsi="Times New Roman" w:cs="Times New Roman"/>
+        </w:rPr>
+        <w:t xml:space="preserve">, le test s’est </w:t>
+      </w:r>
+      <w:proofErr w:type="gramStart"/>
+      <w:r>
+        <w:rPr>
+          <w:rFonts w:ascii="Times New Roman" w:hAnsi="Times New Roman" w:cs="Times New Roman"/>
+        </w:rPr>
+        <w:t>passer</w:t>
+      </w:r>
+      <w:proofErr w:type="gramEnd"/>
+      <w:r>
+        <w:rPr>
+          <w:rFonts w:ascii="Times New Roman" w:hAnsi="Times New Roman" w:cs="Times New Roman"/>
+        </w:rPr>
+        <w:t xml:space="preserve"> avec </w:t>
+      </w:r>
+      <w:proofErr w:type="spellStart"/>
+      <w:r>
+        <w:rPr>
+          <w:rFonts w:ascii="Times New Roman" w:hAnsi="Times New Roman" w:cs="Times New Roman"/>
+        </w:rPr>
+        <w:t>succes</w:t>
+      </w:r>
+      <w:proofErr w:type="spellEnd"/>
+      <w:r>
+        <w:rPr>
+          <w:rFonts w:ascii="Times New Roman" w:hAnsi="Times New Roman" w:cs="Times New Roman"/>
+        </w:rPr>
+        <w:t>.</w:t>
+      </w:r>
+    </w:p>
+    <w:p>
+      <w:pPr>
+        <w:pStyle w:val="Paragraphedeliste"/>
+        <w:rPr>
+          <w:rFonts w:ascii="Times New Roman" w:hAnsi="Times New Roman" w:cs="Times New Roman"/>
+        </w:rPr>
+      </w:pPr>
+      <w:r>
+        <w:rPr>
+          <w:rFonts w:ascii="Times New Roman" w:hAnsi="Times New Roman" w:cs="Times New Roman"/>
+        </w:rPr>
+        <w:t>C- TEST DE WIDGET</w:t>
+      </w:r>
+    </w:p>
+    <w:p>
+      <w:pPr>
+        <w:pStyle w:val="Paragraphedeliste"/>
+        <w:rPr>
+          <w:rFonts w:ascii="Times New Roman" w:hAnsi="Times New Roman" w:cs="Times New Roman"/>
+        </w:rPr>
+      </w:pPr>
+      <w:r>
+        <w:rPr>
+          <w:rFonts w:ascii="Times New Roman" w:hAnsi="Times New Roman" w:cs="Times New Roman"/>
+        </w:rPr>
+        <w:lastRenderedPageBreak/>
+        <w:drawing>
+          <wp:inline distT="0" distB="0" distL="0" distR="0" wp14:anchorId="2216253C" wp14:editId="469F2D5D">
+            <wp:extent cx="5696243" cy="571529"/>
+            <wp:effectExtent l="0" t="0" r="0" b="0"/>
+            <wp:docPr id="959878172" name="Image 1"/>
+            <wp:cNvGraphicFramePr>
+              <a:graphicFrameLocks xmlns:a="http://schemas.openxmlformats.org/drawingml/2006/main" noChangeAspect="1"/>
+            </wp:cNvGraphicFramePr>
+            <a:graphic xmlns:a="http://schemas.openxmlformats.org/drawingml/2006/main">
+              <a:graphicData uri="http://schemas.openxmlformats.org/drawingml/2006/picture">
+                <pic:pic xmlns:pic="http://schemas.openxmlformats.org/drawingml/2006/picture">
+                  <pic:nvPicPr>
+                    <pic:cNvPr id="959878172" name=""/>
+                    <pic:cNvPicPr/>
+                  </pic:nvPicPr>
+                  <pic:blipFill>
+                    <a:blip r:embed="rId21"/>
+                    <a:stretch>
+                      <a:fillRect/>
+                    </a:stretch>
+                  </pic:blipFill>
+                  <pic:spPr>
+                    <a:xfrm>
+                      <a:off x="0" y="0"/>
+                      <a:ext cx="5696243" cy="571529"/>
+                    </a:xfrm>
+                    <a:prstGeom prst="rect">
+                      <a:avLst/>
+                    </a:prstGeom>
+                  </pic:spPr>
+                </pic:pic>
+              </a:graphicData>
+            </a:graphic>
+          </wp:inline>
+        </w:drawing>
+      </w:r>
+    </w:p>
+    <w:p>
+      <w:pPr>
+        <w:pStyle w:val="Paragraphedeliste"/>
+        <w:rPr>
+          <w:rFonts w:ascii="Times New Roman" w:hAnsi="Times New Roman" w:cs="Times New Roman"/>
+        </w:rPr>
+      </w:pPr>
+      <w:r>
+        <w:rPr>
+          <w:rFonts w:ascii="Times New Roman" w:hAnsi="Times New Roman" w:cs="Times New Roman"/>
+        </w:rPr>
+        <w:t xml:space="preserve">Voici le test sur le widget pour verifier la </w:t>
+      </w:r>
+      <w:proofErr w:type="spellStart"/>
+      <w:r>
+        <w:rPr>
+          <w:rFonts w:ascii="Times New Roman" w:hAnsi="Times New Roman" w:cs="Times New Roman"/>
+        </w:rPr>
+        <w:t>presence</w:t>
+      </w:r>
+      <w:proofErr w:type="spellEnd"/>
+      <w:r>
+        <w:rPr>
+          <w:rFonts w:ascii="Times New Roman" w:hAnsi="Times New Roman" w:cs="Times New Roman"/>
+        </w:rPr>
+        <w:t xml:space="preserve"> du bouton dans le code.</w:t>
+      </w:r>
+    </w:p>
+    <w:p>
+      <w:pPr>
+        <w:pStyle w:val="Paragraphedeliste"/>
+        <w:rPr>
+          <w:rFonts w:ascii="Times New Roman" w:hAnsi="Times New Roman" w:cs="Times New Roman"/>
+        </w:rPr>
+      </w:pPr>
+      <w:r>
+        <w:rPr>
+          <w:rFonts w:ascii="Times New Roman" w:hAnsi="Times New Roman" w:cs="Times New Roman"/>
+        </w:rPr>
+        <w:t>D- TEST D’INTEGRATION</w:t>
+      </w:r>
+    </w:p>
+    <w:p>
+      <w:pPr>
+        <w:pStyle w:val="Paragraphedeliste"/>
+        <w:rPr>
+          <w:rFonts w:ascii="Times New Roman" w:hAnsi="Times New Roman" w:cs="Times New Roman"/>
+        </w:rPr>
+      </w:pPr>
+      <w:r>
+        <w:rPr>
+          <w:rFonts w:ascii="Times New Roman" w:hAnsi="Times New Roman" w:cs="Times New Roman"/>
+        </w:rPr>
+        <w:drawing>
+          <wp:inline distT="0" distB="0" distL="0" distR="0" wp14:anchorId="285A6703" wp14:editId="2F2EB289">
+            <wp:extent cx="5429529" cy="3314870"/>
+            <wp:effectExtent l="0" t="0" r="0" b="0"/>
+            <wp:docPr id="1988221263" name="Image 1"/>
+            <wp:cNvGraphicFramePr>
+              <a:graphicFrameLocks xmlns:a="http://schemas.openxmlformats.org/drawingml/2006/main" noChangeAspect="1"/>
+            </wp:cNvGraphicFramePr>
+            <a:graphic xmlns:a="http://schemas.openxmlformats.org/drawingml/2006/main">
+              <a:graphicData uri="http://schemas.openxmlformats.org/drawingml/2006/picture">
+                <pic:pic xmlns:pic="http://schemas.openxmlformats.org/drawingml/2006/picture">
+                  <pic:nvPicPr>
+                    <pic:cNvPr id="1988221263" name=""/>
+                    <pic:cNvPicPr/>
+                  </pic:nvPicPr>
+                  <pic:blipFill>
+                    <a:blip r:embed="rId22"/>
+                    <a:stretch>
+                      <a:fillRect/>
+                    </a:stretch>
+                  </pic:blipFill>
+                  <pic:spPr>
+                    <a:xfrm>
+                      <a:off x="0" y="0"/>
+                      <a:ext cx="5429529" cy="3314870"/>
+                    </a:xfrm>
+                    <a:prstGeom prst="rect">
+                      <a:avLst/>
+                    </a:prstGeom>
+                  </pic:spPr>
+                </pic:pic>
+              </a:graphicData>
+            </a:graphic>
+          </wp:inline>
+        </w:drawing>
+      </w:r>
+    </w:p>
+    <w:p>
+      <w:pPr>
+        <w:pStyle w:val="Paragraphedeliste"/>
+        <w:rPr>
+          <w:rFonts w:ascii="Times New Roman" w:hAnsi="Times New Roman" w:cs="Times New Roman"/>
+        </w:rPr>
+      </w:pPr>
+      <w:r>
+        <w:rPr>
+          <w:rFonts w:ascii="Times New Roman" w:hAnsi="Times New Roman" w:cs="Times New Roman"/>
+        </w:rPr>
+        <w:t>Je voulais intégrer le test d’intégration et le package énoncer dans le cours est révolue</w:t>
+      </w:r>
+    </w:p>
+    <w:p>
+      <w:pPr>
+        <w:pStyle w:val="Paragraphedeliste"/>
+        <w:rPr>
+          <w:rFonts w:ascii="Times New Roman" w:hAnsi="Times New Roman" w:cs="Times New Roman"/>
+        </w:rPr>
+      </w:pPr>
+      <w:r>
+        <w:rPr>
+          <w:rFonts w:ascii="Times New Roman" w:hAnsi="Times New Roman" w:cs="Times New Roman"/>
+        </w:rPr>
+        <w:drawing>
+          <wp:inline distT="0" distB="0" distL="0" distR="0" wp14:anchorId="57DB8FE7" wp14:editId="14167CDC">
+            <wp:extent cx="5760720" cy="821055"/>
+            <wp:effectExtent l="0" t="0" r="0" b="0"/>
+            <wp:docPr id="316631547" name="Image 1"/>
+            <wp:cNvGraphicFramePr>
+              <a:graphicFrameLocks xmlns:a="http://schemas.openxmlformats.org/drawingml/2006/main" noChangeAspect="1"/>
+            </wp:cNvGraphicFramePr>
+            <a:graphic xmlns:a="http://schemas.openxmlformats.org/drawingml/2006/main">
+              <a:graphicData uri="http://schemas.openxmlformats.org/drawingml/2006/picture">
+                <pic:pic xmlns:pic="http://schemas.openxmlformats.org/drawingml/2006/picture">
+                  <pic:nvPicPr>
+                    <pic:cNvPr id="316631547" name=""/>
+                    <pic:cNvPicPr/>
+                  </pic:nvPicPr>
+                  <pic:blipFill>
+                    <a:blip r:embed="rId23"/>
+                    <a:stretch>
+                      <a:fillRect/>
+                    </a:stretch>
+                  </pic:blipFill>
+                  <pic:spPr>
+                    <a:xfrm>
+                      <a:off x="0" y="0"/>
+                      <a:ext cx="5760720" cy="821055"/>
+                    </a:xfrm>
+                    <a:prstGeom prst="rect">
+                      <a:avLst/>
+                    </a:prstGeom>
+                  </pic:spPr>
+                </pic:pic>
+              </a:graphicData>
+            </a:graphic>
+          </wp:inline>
+        </w:drawing>
+      </w:r>
+    </w:p>
+    <w:p>
+      <w:pPr>
+        <w:pStyle w:val="Paragraphedeliste"/>
+        <w:rPr>
+          <w:rFonts w:ascii="Times New Roman" w:hAnsi="Times New Roman" w:cs="Times New Roman"/>
+        </w:rPr>
+      </w:pPr>
+      <w:r>
+        <w:rPr>
+          <w:rFonts w:ascii="Times New Roman" w:hAnsi="Times New Roman" w:cs="Times New Roman"/>
+        </w:rPr>
+        <w:t xml:space="preserve">Pour le </w:t>
+      </w:r>
+      <w:proofErr w:type="spellStart"/>
+      <w:r>
+        <w:rPr>
+          <w:rFonts w:ascii="Times New Roman" w:hAnsi="Times New Roman" w:cs="Times New Roman"/>
+        </w:rPr>
+        <w:t>devtools</w:t>
+      </w:r>
+      <w:proofErr w:type="spellEnd"/>
+      <w:r>
+        <w:rPr>
+          <w:rFonts w:ascii="Times New Roman" w:hAnsi="Times New Roman" w:cs="Times New Roman"/>
+        </w:rPr>
+        <w:t xml:space="preserve">, </w:t>
+      </w:r>
+      <w:proofErr w:type="spellStart"/>
+      <w:r>
+        <w:rPr>
+          <w:rFonts w:ascii="Times New Roman" w:hAnsi="Times New Roman" w:cs="Times New Roman"/>
+        </w:rPr>
+        <w:t>jutilise</w:t>
+      </w:r>
+      <w:proofErr w:type="spellEnd"/>
+      <w:r>
+        <w:rPr>
+          <w:rFonts w:ascii="Times New Roman" w:hAnsi="Times New Roman" w:cs="Times New Roman"/>
+        </w:rPr>
+        <w:t xml:space="preserve"> directement </w:t>
+      </w:r>
+      <w:proofErr w:type="spellStart"/>
+      <w:r>
+        <w:rPr>
+          <w:rFonts w:ascii="Times New Roman" w:hAnsi="Times New Roman" w:cs="Times New Roman"/>
+        </w:rPr>
+        <w:t>loutil</w:t>
+      </w:r>
+      <w:proofErr w:type="spellEnd"/>
+      <w:r>
+        <w:rPr>
+          <w:rFonts w:ascii="Times New Roman" w:hAnsi="Times New Roman" w:cs="Times New Roman"/>
+        </w:rPr>
+        <w:t xml:space="preserve"> </w:t>
+      </w:r>
+      <w:proofErr w:type="spellStart"/>
+      <w:r>
+        <w:rPr>
+          <w:rFonts w:ascii="Times New Roman" w:hAnsi="Times New Roman" w:cs="Times New Roman"/>
+        </w:rPr>
+        <w:t>integrer</w:t>
+      </w:r>
+      <w:proofErr w:type="spellEnd"/>
+      <w:r>
+        <w:rPr>
+          <w:rFonts w:ascii="Times New Roman" w:hAnsi="Times New Roman" w:cs="Times New Roman"/>
+        </w:rPr>
+        <w:t xml:space="preserve"> dans mon </w:t>
+      </w:r>
+      <w:proofErr w:type="spellStart"/>
+      <w:r>
+        <w:rPr>
+          <w:rFonts w:ascii="Times New Roman" w:hAnsi="Times New Roman" w:cs="Times New Roman"/>
+        </w:rPr>
+        <w:t>vscode</w:t>
+      </w:r>
+      <w:proofErr w:type="spellEnd"/>
+      <w:r>
+        <w:rPr>
+          <w:rFonts w:ascii="Times New Roman" w:hAnsi="Times New Roman" w:cs="Times New Roman"/>
+        </w:rPr>
+        <w:t>.</w:t>
+      </w:r>
+    </w:p>
+    <w:p>
+      <w:pPr>
+        <w:pStyle w:val="Paragraphedeliste"/>
+        <w:rPr>
+          <w:rFonts w:ascii="Times New Roman" w:hAnsi="Times New Roman" w:cs="Times New Roman"/>
+        </w:rPr>
+      </w:pPr>
+      <w:r>
+        <w:rPr>
+          <w:rFonts w:ascii="Times New Roman" w:hAnsi="Times New Roman" w:cs="Times New Roman"/>
+        </w:rPr>
+        <w:lastRenderedPageBreak/>
+        <w:drawing>
+          <wp:anchor distT="0" distB="0" distL="114300" distR="114300" simplePos="0" relativeHeight="251658240" behindDoc="0" locked="0" layoutInCell="1" allowOverlap="1" wp14:anchorId="0677CFAF" wp14:editId="28636127">
+            <wp:simplePos x="0" y="0"/>
+            <wp:positionH relativeFrom="column">
+              <wp:posOffset>2713355</wp:posOffset>
+            </wp:positionH>
+            <wp:positionV relativeFrom="paragraph">
+              <wp:posOffset>27305</wp:posOffset>
+            </wp:positionV>
+            <wp:extent cx="1987550" cy="4699000"/>
+            <wp:effectExtent l="0" t="0" r="0" b="6350"/>
+            <wp:wrapSquare wrapText="bothSides"/>
+            <wp:docPr id="73069158" name="Image 1"/>
+            <wp:cNvGraphicFramePr>
+              <a:graphicFrameLocks xmlns:a="http://schemas.openxmlformats.org/drawingml/2006/main" noChangeAspect="1"/>
+            </wp:cNvGraphicFramePr>
+            <a:graphic xmlns:a="http://schemas.openxmlformats.org/drawingml/2006/main">
+              <a:graphicData uri="http://schemas.openxmlformats.org/drawingml/2006/picture">
+                <pic:pic xmlns:pic="http://schemas.openxmlformats.org/drawingml/2006/picture">
+                  <pic:nvPicPr>
+                    <pic:cNvPr id="73069158" name=""/>
+                    <pic:cNvPicPr/>
+                  </pic:nvPicPr>
+                  <pic:blipFill>
+                    <a:blip r:embed="rId24">
+                      <a:extLst>
+                        <a:ext uri="{28A0092B-C50C-407E-A947-70E740481C1C}">
+                          <a14:useLocalDpi xmlns:a14="http://schemas.microsoft.com/office/drawing/2010/main" val="0"/>
+                        </a:ext>
+                      </a:extLst>
+                    </a:blip>
+                    <a:stretch>
+                      <a:fillRect/>
+                    </a:stretch>
+                  </pic:blipFill>
+                  <pic:spPr>
+                    <a:xfrm>
+                      <a:off x="0" y="0"/>
+                      <a:ext cx="1987550" cy="4699000"/>
+                    </a:xfrm>
+                    <a:prstGeom prst="rect">
+                      <a:avLst/>
+                    </a:prstGeom>
+                  </pic:spPr>
+                </pic:pic>
+              </a:graphicData>
+            </a:graphic>
+            <wp14:sizeRelV relativeFrom="margin">
+              <wp14:pctHeight>0</wp14:pctHeight>
+            </wp14:sizeRelV>
+          </wp:anchor>
+        </w:drawing>
+      </w:r>
+      <w:r>
+        <w:rPr>
+          <w:rFonts w:ascii="Times New Roman" w:hAnsi="Times New Roman" w:cs="Times New Roman"/>
+        </w:rPr>
+        <w:drawing>
+          <wp:inline distT="0" distB="0" distL="0" distR="0" wp14:anchorId="2BD4A9DE" wp14:editId="24E43476">
+            <wp:extent cx="1924149" cy="4667490"/>
+            <wp:effectExtent l="0" t="0" r="0" b="0"/>
+            <wp:docPr id="1412288351" name="Image 1"/>
+            <wp:cNvGraphicFramePr>
+              <a:graphicFrameLocks xmlns:a="http://schemas.openxmlformats.org/drawingml/2006/main" noChangeAspect="1"/>
+            </wp:cNvGraphicFramePr>
+            <a:graphic xmlns:a="http://schemas.openxmlformats.org/drawingml/2006/main">
+              <a:graphicData uri="http://schemas.openxmlformats.org/drawingml/2006/picture">
+                <pic:pic xmlns:pic="http://schemas.openxmlformats.org/drawingml/2006/picture">
+                  <pic:nvPicPr>
+                    <pic:cNvPr id="1412288351" name=""/>
+                    <pic:cNvPicPr/>
+                  </pic:nvPicPr>
+                  <pic:blipFill>
+                    <a:blip r:embed="rId25"/>
+                    <a:stretch>
+                      <a:fillRect/>
+                    </a:stretch>
+                  </pic:blipFill>
+                  <pic:spPr>
+                    <a:xfrm>
+                      <a:off x="0" y="0"/>
+                      <a:ext cx="1924149" cy="4667490"/>
+                    </a:xfrm>
+                    <a:prstGeom prst="rect">
+                      <a:avLst/>
+                    </a:prstGeom>
+                  </pic:spPr>
+                </pic:pic>
+              </a:graphicData>
+            </a:graphic>
+          </wp:inline>
+        </w:drawing>
+      </w:r>
+    </w:p>
+    <w:p>
+      <w:pPr>
+        <w:pStyle w:val="Paragraphedeliste"/>
+        <w:rPr>
+          <w:rFonts w:ascii="Times New Roman" w:hAnsi="Times New Roman" w:cs="Times New Roman"/>
+        </w:rPr>
+      </w:pPr>
+    </w:p>
+    <w:p>
+      <w:pPr>
+        <w:pStyle w:val="Paragraphedeliste"/>
+        <w:jc w:val="both"/>
+        <w:rPr>
+          <w:rFonts w:ascii="Times New Roman" w:hAnsi="Times New Roman" w:cs="Times New Roman"/>
+        </w:rPr>
+      </w:pPr>
+      <w:r>
+        <w:rPr>
+          <w:rFonts w:ascii="Times New Roman" w:hAnsi="Times New Roman" w:cs="Times New Roman"/>
+        </w:rPr>
+        <w:t xml:space="preserve">Pour ce qui est de proposition, </w:t>
+      </w:r>
+      <w:proofErr w:type="spellStart"/>
+      <w:r>
+        <w:rPr>
+          <w:rFonts w:ascii="Times New Roman" w:hAnsi="Times New Roman" w:cs="Times New Roman"/>
+        </w:rPr>
+        <w:t>jimaerais</w:t>
+      </w:r>
+      <w:proofErr w:type="spellEnd"/>
+      <w:r>
+        <w:rPr>
+          <w:rFonts w:ascii="Times New Roman" w:hAnsi="Times New Roman" w:cs="Times New Roman"/>
+        </w:rPr>
+        <w:t xml:space="preserve"> ajouter un truc :</w:t>
+      </w:r>
+    </w:p>
+    <w:p>
+      <w:pPr>
+        <w:pStyle w:val="Paragraphedeliste"/>
+        <w:jc w:val="both"/>
+        <w:rPr>
+          <w:rFonts w:ascii="Times New Roman" w:hAnsi="Times New Roman" w:cs="Times New Roman"/>
+        </w:rPr>
+      </w:pPr>
+      <w:r>
+        <w:rPr>
+          <w:rFonts w:ascii="Times New Roman" w:hAnsi="Times New Roman" w:cs="Times New Roman"/>
+        </w:rPr>
+        <w:t xml:space="preserve">Un </w:t>
+      </w:r>
+      <w:proofErr w:type="spellStart"/>
+      <w:r>
+        <w:rPr>
+          <w:rFonts w:ascii="Times New Roman" w:hAnsi="Times New Roman" w:cs="Times New Roman"/>
+          <w:b/>
+          <w:bCs/>
+        </w:rPr>
+        <w:t>ListTile</w:t>
+      </w:r>
+      <w:proofErr w:type="spellEnd"/>
+      <w:r>
+        <w:rPr>
+          <w:rFonts w:ascii="Times New Roman" w:hAnsi="Times New Roman" w:cs="Times New Roman"/>
+        </w:rPr>
+        <w:t xml:space="preserve"> a besoin d'un widget </w:t>
+      </w:r>
+      <w:proofErr w:type="spellStart"/>
+      <w:r>
+        <w:rPr>
+          <w:rFonts w:ascii="Times New Roman" w:hAnsi="Times New Roman" w:cs="Times New Roman"/>
+          <w:b/>
+          <w:bCs/>
+        </w:rPr>
+        <w:t>Material</w:t>
+      </w:r>
+      <w:proofErr w:type="spellEnd"/>
+      <w:r>
+        <w:rPr>
+          <w:rFonts w:ascii="Times New Roman" w:hAnsi="Times New Roman" w:cs="Times New Roman"/>
+          <w:b/>
+          <w:bCs/>
+        </w:rPr>
+        <w:t xml:space="preserve"> juste au-dessus de lui</w:t>
+      </w:r>
+      <w:r>
+        <w:rPr>
+          <w:rFonts w:ascii="Times New Roman" w:hAnsi="Times New Roman" w:cs="Times New Roman"/>
+        </w:rPr>
+        <w:t xml:space="preserve"> pour dessiner correctement son effet d'encre (le petit effet visuel gris au </w:t>
+      </w:r>
+      <w:proofErr w:type="spellStart"/>
+      <w:r>
+        <w:rPr>
+          <w:rFonts w:ascii="Times New Roman" w:hAnsi="Times New Roman" w:cs="Times New Roman"/>
+        </w:rPr>
+        <w:t>tap</w:t>
+      </w:r>
+      <w:proofErr w:type="spellEnd"/>
+      <w:r>
+        <w:rPr>
+          <w:rFonts w:ascii="Times New Roman" w:hAnsi="Times New Roman" w:cs="Times New Roman"/>
+        </w:rPr>
+        <w:t xml:space="preserve">) et son fond. Mais ici, c'est un Container avec un </w:t>
+      </w:r>
+      <w:proofErr w:type="spellStart"/>
+      <w:r>
+        <w:rPr>
+          <w:rFonts w:ascii="Times New Roman" w:hAnsi="Times New Roman" w:cs="Times New Roman"/>
+          <w:b/>
+          <w:bCs/>
+        </w:rPr>
+        <w:t>BoxDecoration</w:t>
+      </w:r>
+      <w:proofErr w:type="spellEnd"/>
+      <w:r>
+        <w:rPr>
+          <w:rFonts w:ascii="Times New Roman" w:hAnsi="Times New Roman" w:cs="Times New Roman"/>
+        </w:rPr>
+        <w:t xml:space="preserve"> coloré qui l'entoure directement — Flutter considère que ça peut </w:t>
+      </w:r>
+      <w:r>
+        <w:rPr>
+          <w:rFonts w:ascii="Times New Roman" w:hAnsi="Times New Roman" w:cs="Times New Roman"/>
+          <w:b/>
+          <w:bCs/>
+        </w:rPr>
+        <w:t>cacher</w:t>
+      </w:r>
+      <w:r>
+        <w:rPr>
+          <w:rFonts w:ascii="Times New Roman" w:hAnsi="Times New Roman" w:cs="Times New Roman"/>
+        </w:rPr>
+        <w:t xml:space="preserve"> l'effet d'encre du </w:t>
+      </w:r>
+      <w:proofErr w:type="spellStart"/>
+      <w:r>
+        <w:rPr>
+          <w:rFonts w:ascii="Times New Roman" w:hAnsi="Times New Roman" w:cs="Times New Roman"/>
+          <w:b/>
+          <w:bCs/>
+        </w:rPr>
+        <w:t>ListTile</w:t>
+      </w:r>
+      <w:proofErr w:type="spellEnd"/>
+      <w:r>
+        <w:rPr>
+          <w:rFonts w:ascii="Times New Roman" w:hAnsi="Times New Roman" w:cs="Times New Roman"/>
+          <w:b/>
+          <w:bCs/>
+        </w:rPr>
+        <w:t>,</w:t>
+      </w:r>
+      <w:r>
+        <w:rPr>
+          <w:rFonts w:ascii="Times New Roman" w:hAnsi="Times New Roman" w:cs="Times New Roman"/>
+        </w:rPr>
+        <w:t xml:space="preserve"> et lève une assertion (erreur) à ce sujet en mode </w:t>
+      </w:r>
+      <w:proofErr w:type="spellStart"/>
+      <w:r>
+        <w:rPr>
+          <w:rFonts w:ascii="Times New Roman" w:hAnsi="Times New Roman" w:cs="Times New Roman"/>
+        </w:rPr>
+        <w:t>debug</w:t>
+      </w:r>
+      <w:proofErr w:type="spellEnd"/>
+      <w:r>
+        <w:rPr>
+          <w:rFonts w:ascii="Times New Roman" w:hAnsi="Times New Roman" w:cs="Times New Roman"/>
+        </w:rPr>
+        <w:t>/test.</w:t>
+      </w:r>
+    </w:p>
+    <w:p>
+      <w:pPr>
+        <w:pStyle w:val="Paragraphedeliste"/>
+        <w:jc w:val="both"/>
+        <w:rPr>
+          <w:rFonts w:ascii="Times New Roman" w:hAnsi="Times New Roman" w:cs="Times New Roman"/>
+        </w:rPr>
+      </w:pPr>
+      <w:r>
+        <w:rPr>
+          <w:rFonts w:ascii="Times New Roman" w:hAnsi="Times New Roman" w:cs="Times New Roman"/>
+        </w:rPr>
+        <w:t xml:space="preserve">Cette assertion se déclenche </w:t>
+      </w:r>
+      <w:r>
+        <w:rPr>
+          <w:rFonts w:ascii="Times New Roman" w:hAnsi="Times New Roman" w:cs="Times New Roman"/>
+          <w:b/>
+          <w:bCs/>
+        </w:rPr>
+        <w:t>5 fois</w:t>
+      </w:r>
+      <w:r>
+        <w:rPr>
+          <w:rFonts w:ascii="Times New Roman" w:hAnsi="Times New Roman" w:cs="Times New Roman"/>
+        </w:rPr>
+        <w:t xml:space="preserve"> (une par étudiant dans ta liste), ce qui fait échouer le test </w:t>
+      </w:r>
+      <w:proofErr w:type="gramStart"/>
+      <w:r>
+        <w:rPr>
+          <w:rFonts w:ascii="Times New Roman" w:hAnsi="Times New Roman" w:cs="Times New Roman"/>
+        </w:rPr>
+        <w:t xml:space="preserve">entier </w:t>
+      </w:r>
+      <w:r>
+        <w:rPr>
+          <w:rFonts w:ascii="Times New Roman" w:hAnsi="Times New Roman" w:cs="Times New Roman"/>
+        </w:rPr>
+        <w:t>.</w:t>
+      </w:r>
+      <w:proofErr w:type="gramEnd"/>
+    </w:p>
+    <w:p>
+      <w:pPr>
+        <w:pStyle w:val="Paragraphedeliste"/>
+        <w:rPr>
+          <w:rFonts w:ascii="Times New Roman" w:hAnsi="Times New Roman" w:cs="Times New Roman"/>
+        </w:rPr>
+      </w:pPr>
+    </w:p>
     <w:sectPr>
-      <w:headerReference w:type="default" r:id="rId20"/>
-      <w:footerReference w:type="default" r:id="rId21"/>
+      <w:headerReference w:type="default" r:id="rId26"/>
+      <w:footerReference w:type="default" r:id="rId27"/>
       <w:pgSz w:w="11906" w:h="16838"/>
       <w:pgMar w:top="1417" w:right="1417" w:bottom="1417" w:left="1417" w:header="708" w:footer="708" w:gutter="0"/>
       <w:cols w:space="708"/>
@@ -2487,7 +3351,6 @@
   <w:style w:type="character" w:default="1" w:styleId="Policepardfaut">
     <w:name w:val="Default Paragraph Font"/>
     <w:uiPriority w:val="1"/>
-    <w:semiHidden/>
     <w:unhideWhenUsed/>
   </w:style>
   <w:style w:type="table" w:default="1" w:styleId="TableauNormal">

</xml_diff>